<commit_message>
Allow flexible Wyscout source filenames
</commit_message>
<xml_diff>
--- a/docs/xml_ingestion_guide.docx
+++ b/docs/xml_ingestion_guide.docx
@@ -95,7 +95,7 @@
           <w:color w:val="373737"/>
           <w:sz w:val="19"/>
         </w:rPr>
-        <w:t>Open the match menu shown in Wyscout and download the six current XML exports below. Keep the names Wyscout gives them.</w:t>
+        <w:t>Open the match menu shown in Wyscout and download the six current XML exports below. The parser identifies them by content, so filenames are flexible.</w:t>
       </w:r>
     </w:p>
     <w:tbl>
@@ -754,7 +754,7 @@
           <w:color w:val="6B1F2A"/>
           <w:sz w:val="30"/>
         </w:rPr>
-        <w:t>2  What the downloaded names look like</w:t>
+        <w:t>2  Filenames: keep or rename</w:t>
       </w:r>
     </w:p>
     <w:p>
@@ -768,7 +768,7 @@
           <w:color w:val="373737"/>
           <w:sz w:val="19"/>
         </w:rPr>
-        <w:t>The exact words and date order are controlled by Wyscout. They may look like these examples:</w:t>
+        <w:t>You may keep Wyscout's names or use a consistent team convention. Wyscout names may look like these examples:</w:t>
       </w:r>
     </w:p>
     <w:p>
@@ -950,7 +950,7 @@
                 <w:color w:val="6B1F2A"/>
                 <w:sz w:val="19"/>
               </w:rPr>
-              <w:t>Do not rename, edit, convert, combine, or resave the downloads. A filename ending in (1) is okay. Wyscout may use DD-MM-YYYY even though our match folder uses YYYY-MM-DD.</w:t>
+              <w:t>Renaming is optional. Keep Wyscout's name or use &lt;match_slug&gt;_wyscout_&lt;file-type&gt;.xml. Keep the .xml extension, never overwrite an older source file, and never edit or resave the XML contents.</w:t>
             </w:r>
           </w:p>
         </w:tc>
@@ -995,7 +995,7 @@
           <w:color w:val="373737"/>
           <w:sz w:val="19"/>
         </w:rPr>
-        <w:t>Our match folder uses a simple, consistent slug even though the files inside keep Wyscout's names.</w:t>
+        <w:t>Our match folder uses a simple, consistent slug. Files inside may keep Wyscout's names or use the optional team convention.</w:t>
       </w:r>
     </w:p>
     <w:tbl>
@@ -1534,7 +1534,7 @@
                 <w:color w:val="6B1F2A"/>
                 <w:sz w:val="19"/>
               </w:rPr>
-              <w:t>Questions? Ask Anissa before changing an original file. Do not publish data or push directly to main.</w:t>
+              <w:t>Questions? Ask Anissa before changing XML contents or replacing a source file. Do not publish data or push directly to main.</w:t>
             </w:r>
           </w:p>
         </w:tc>

</xml_diff>